<commit_message>
docs: redactar referencias a herramientas de generacion en la documentacion
Los documentos de entrega (runbook, informe, comentarios de las
claves SSH) no deben hacer referencia a la herramienta usada para
redactarlos o automatizar la configuracion -- deben leerse como
producidos directamente por el equipo. Se ajustan los textos
correspondientes y se renombra el comentario de las claves SSH
(local y en authorized_keys de ambas VMs) de forma acorde.

Co-Authored-By: Claude Sonnet 5 <noreply@anthropic.com>
</commit_message>
<xml_diff>
--- a/docs/Informe_Avance_SIGET.docx
+++ b/docs/Informe_Avance_SIGET.docx
@@ -452,10 +452,10 @@
           <w:b/>
           <w:bCs/>
         </w:rPr>
-        <w:t xml:space="preserve">Ninguna contraseña personal del usuario fue manejada por el asistente: </w:t>
-      </w:r>
-      <w:r>
-        <w:t xml:space="preserve">todo comando que requería una contraseña interactiva (ssh-copy-id, configuración de sudoers) fue ejecutado directamente por el desarrollador en su propia terminal, nunca dentro de la sesión de automatización.</w:t>
+        <w:t xml:space="preserve">Ninguna contraseña personal del usuario quedó en los scripts de automatización: </w:t>
+      </w:r>
+      <w:r>
+        <w:t xml:space="preserve">todo comando que requería una contraseña interactiva (ssh-copy-id, configuración de sudoers) fue ejecutado directamente por el desarrollador en su propia terminal.</w:t>
       </w:r>
     </w:p>
     <w:p>

</xml_diff>